<commit_message>
feat: refonte complete de l exercice 07 (modele anti-surentrainement en football) et ajout des donnees brutes pour Ex 03, 04, 05
</commit_message>
<xml_diff>
--- a/docs/public/documents/Exercice-07-Tutoriel.docx
+++ b/docs/public/documents/Exercice-07-Tutoriel.docx
@@ -13,7 +13,7 @@
           <w:color w:val="1E3A8A"/>
           <w:sz w:val="36"/>
         </w:rPr>
-        <w:t>TUTORIEL MÉTHODOLOGIQUE DE RÉFÉRENCE</w:t>
+        <w:t>TUTORIEL MÉTHODOLOGIQUE PAS-À-PAS</w:t>
       </w:r>
     </w:p>
     <w:p>
@@ -27,7 +27,7 @@
           <w:color w:val="64748B"/>
           <w:sz w:val="24"/>
         </w:rPr>
-        <w:t>Exercice 07 : Mission Professionnelle Finale — Du Terrain à la Décision</w:t>
+        <w:t>Exercice 07 : Concevoir son Modèle de Détection &amp; Lutte contre le Surentraînement en Football</w:t>
         <w:br/>
         <w:t>Spécialisation Préparateur Physique — HECh (Évaluation Finale 30 points / 30%)</w:t>
       </w:r>
@@ -71,7 +71,7 @@
                 <w:color w:val="1E3A8A"/>
                 <w:sz w:val="22"/>
               </w:rPr>
-              <w:t>📌 Cadre de la Mission Finale</w:t>
+              <w:t>📌 Cadre Professionnel de l'Exercice</w:t>
               <w:br/>
             </w:r>
             <w:r>
@@ -80,7 +80,7 @@
                 <w:color w:val="334155"/>
                 <w:sz w:val="20"/>
               </w:rPr>
-              <w:t>Vous êtes placé en situation réelle de responsable de la préparation physique d'un club de sport collectif de haut niveau. Durant 6 semaines, vous devez consolider et exploiter un jeu de données multisources (217 séances, 504 questionnaires de bien-être, tests physiques pré/post et temps de jeu en compétition). Votre mission ne consiste pas à empiler des chiffres, mais à filtrer le signal du bruit pour fournir au staff technique un tableau de bord d'aide à la décision opérationnelle.</w:t>
+              <w:t>Dans le football de haut niveau contemporain, le préparateur physique ne doit plus se limiter à enregistrer des kilomètres. Son rôle déterminant est de croiser les signaux faibles pour distinguer le surmenage fonctionnel bénéfique (Functional Overreaching) du surmenage non fonctionnel dangereux (Non-Functional Overreaching) qui mène au syndrome de surentraînement (Overtraining Syndrome) et à la blessure. Ce tutoriel vous guide pas-à-pas pour bâtir votre propre modèle algorithmique sous Microsoft Excel.</w:t>
             </w:r>
           </w:p>
         </w:tc>
@@ -100,7 +100,7 @@
           <w:b/>
           <w:sz w:val="24"/>
         </w:rPr>
-        <w:t>Guide des 6 Étapes Clés pour Réussir votre Travail :</w:t>
+        <w:t>Les 6 Étapes Fondamentales de votre Modèle :</w:t>
       </w:r>
     </w:p>
     <w:p>
@@ -109,7 +109,7 @@
         <w:spacing w:before="20" w:after="40"/>
       </w:pPr>
       <w:r>
-        <w:t>Étape 1 : Nettoyage et Contrôle Qualité des Données (Data Auditing)</w:t>
+        <w:t>Étape 1 : Structuration et Contrôle Qualité des Métriques GPS, Cardio et Bien-Être</w:t>
       </w:r>
     </w:p>
     <w:p>
@@ -118,7 +118,7 @@
         <w:spacing w:before="20" w:after="40"/>
       </w:pPr>
       <w:r>
-        <w:t>Étape 2 : Quantification des Charges et Modélisation du Risque (ACWR de Gabbett)</w:t>
+        <w:t>Étape 2 : Quantification des Ratios de Charge ACWR (Distance, Haute Vitesse HSR, Sprints)</w:t>
       </w:r>
     </w:p>
     <w:p>
@@ -127,7 +127,7 @@
         <w:spacing w:before="20" w:after="40"/>
       </w:pPr>
       <w:r>
-        <w:t>Étape 3 : Traitement Longitudinal du Bien-Être (Sommeil, Fatigue, Douleurs)</w:t>
+        <w:t>Étape 3 : Détection du Découplage Charge Externe vs Charge Interne &amp; Dérive Cardiaque</w:t>
       </w:r>
     </w:p>
     <w:p>
@@ -136,7 +136,7 @@
         <w:spacing w:before="20" w:after="40"/>
       </w:pPr>
       <w:r>
-        <w:t>Étape 4 : Analyse Statistique Pré/Post des Tests Physiques (Semaine 1 vs Semaine 6)</w:t>
+        <w:t>Étape 4 : Modélisation Algorithmique du Score de Vulnérabilité au Surentraînement (/100)</w:t>
       </w:r>
     </w:p>
     <w:p>
@@ -145,7 +145,7 @@
         <w:spacing w:before="20" w:after="40"/>
       </w:pPr>
       <w:r>
-        <w:t>Étape 5 : Conception du Tableau de Bord Exécutif Staff &amp; Préconisations Semaine 7</w:t>
+        <w:t>Étape 5 : Conception du Cockpit Décisionnel pour le Staff &amp; Plan d'Action Semaine 7</w:t>
       </w:r>
     </w:p>
     <w:p>
@@ -154,7 +154,7 @@
         <w:spacing w:before="20" w:after="40"/>
       </w:pPr>
       <w:r>
-        <w:t>Étape 6 : Prototypage de l'Application Mobile de Collecte &amp; Restitution</w:t>
+        <w:t>Étape 6 : Prototypage de l'Outil de Collecte Smartphone &amp; Alertes Terrain</w:t>
       </w:r>
     </w:p>
     <w:p>
@@ -168,12 +168,12 @@
         <w:spacing w:before="280" w:after="120"/>
       </w:pPr>
       <w:r>
-        <w:t>Étape 1 : Nettoyage et Contrôle Qualité des Données Brutes</w:t>
+        <w:t>Étape 1 : Structuration des Métriques GPS &amp; Contrôle Qualité</w:t>
       </w:r>
     </w:p>
     <w:p>
       <w:r>
-        <w:t>Dans un environnement professionnel, les données de terrain ne sont jamais parfaites. Avant toute analyse statistique, vous devez auditer les feuilles RAW_Seances, RAW_Bien-etre et RAW_Tests pour identifier :</w:t>
+        <w:t>Ouvrez le classeur 'donnees_exercice_final_outils_informatiques.xlsx'. Vous disposez des données brutes de 20 joueurs sur 6 semaines. Avant toute formule complexe, vérifiez l'intégrité de vos variables dans la feuille 'RAW_GPS_Seances_Matchs' :</w:t>
       </w:r>
     </w:p>
     <w:p>
@@ -181,7 +181,7 @@
         <w:pStyle w:val="ListBullet"/>
       </w:pPr>
       <w:r>
-        <w:t>• Les doublons de saisie éventuels sur une même date pour un même joueur.</w:t>
+        <w:t>• Vérifiez la cohérence entre la Durée (min) et la Distance totale (km).</w:t>
       </w:r>
     </w:p>
     <w:p>
@@ -189,7 +189,7 @@
         <w:pStyle w:val="ListBullet"/>
       </w:pPr>
       <w:r>
-        <w:t>• Les valeurs aberrantes (par exemple un RPE supérieur à 10 ou une durée négative).</w:t>
+        <w:t>• Contrôlez les seuils de vitesse : Faible (&lt;14.4 km/h), Modérée (14.4-19.8 km/h), HSR (19.8-25.2 km/h) et Sprint (&gt;25.2 km/h).</w:t>
       </w:r>
     </w:p>
     <w:p>
@@ -197,7 +197,21 @@
         <w:pStyle w:val="ListBullet"/>
       </w:pPr>
       <w:r>
-        <w:t>• Les incohérences de statut (ex: Présence notée 0 mais durée réelle ou RPE renseigné).</w:t>
+        <w:t>• Assurez-vous que la colonne Charge_RPE = Durée × RPE soit calculée sans rupture de formule.</w:t>
+      </w:r>
+    </w:p>
+    <w:p>
+      <w:pPr>
+        <w:pStyle w:val="Heading1"/>
+        <w:spacing w:before="280" w:after="120"/>
+      </w:pPr>
+      <w:r>
+        <w:t>Étape 2 : Quantification des Ratios de Charge ACWR</w:t>
+      </w:r>
+    </w:p>
+    <w:p>
+      <w:r>
+        <w:t>Le modèle de Gabbett (Acute:Chronic Workload Ratio) compare la charge aiguë des 7 derniers jours (fatigue immédiate) à la charge chronique des 28 derniers jours (forme et préparation de base). Dans le football moderne, l'ACWR doit être calculé sur :</w:t>
       </w:r>
     </w:p>
     <w:p>
@@ -205,7 +219,23 @@
         <w:pStyle w:val="ListBullet"/>
       </w:pPr>
       <w:r>
-        <w:t>• Les cellules vides ou données manquantes sur les heures de sommeil.</w:t>
+        <w:t>• L'ACWR Distance Totale (Charge mécanique globale).</w:t>
+      </w:r>
+    </w:p>
+    <w:p>
+      <w:pPr>
+        <w:pStyle w:val="ListBullet"/>
+      </w:pPr>
+      <w:r>
+        <w:t>• L'ACWR Courses à Haute Vitesse (HSR) et Sprints (Facteur d'alerte spécifique pour les ischio-jambiers).</w:t>
+      </w:r>
+    </w:p>
+    <w:p>
+      <w:pPr>
+        <w:pStyle w:val="ListBullet"/>
+      </w:pPr>
+      <w:r>
+        <w:t>• La Monotonie de Foster = Moyenne quotidienne / Écart-type (Alerte si &gt; 2.0).</w:t>
       </w:r>
     </w:p>
     <w:tbl>
@@ -247,7 +277,7 @@
                 <w:color w:val="1E3A8A"/>
                 <w:sz w:val="22"/>
               </w:rPr>
-              <w:t>📌 Bonne Pratique Professionnelle</w:t>
+              <w:t>📌 Interprétation des Seuils ACWR</w:t>
               <w:br/>
             </w:r>
             <w:r>
@@ -256,7 +286,13 @@
                 <w:color w:val="334155"/>
                 <w:sz w:val="20"/>
               </w:rPr>
-              <w:t>Créez une feuille '01_Nettoyage_Donnees' listant clairement chaque anomalie repérée, la règle de correction appliquée (ex: suppression du doublon, imputation de la moyenne individuelle pour le sommeil manquant) et la justification méthodologique.</w:t>
+              <w:t>• ACWR &lt; 0.8 : Zone de sous-charge (risque de désentraînement et vulnérabilité).</w:t>
+              <w:br/>
+              <w:t>• 0.8 &lt;= ACWR &lt;= 1.3 : 'Sweet Spot' (zone optimale de progression et de tolérance).</w:t>
+              <w:br/>
+              <w:t>• 1.3 &lt; ACWR &lt; 1.5 : Zone de vigilance (surveillance accrue).</w:t>
+              <w:br/>
+              <w:t>• ACWR &gt;= 1.5 : 'Danger Zone' (sur-charge aiguë majeure, risque de blessure multiplié par 2 à 4).</w:t>
             </w:r>
           </w:p>
         </w:tc>
@@ -273,12 +309,12 @@
         <w:spacing w:before="280" w:after="120"/>
       </w:pPr>
       <w:r>
-        <w:t>Étape 2 : Automatisation des Charges et Modélisation ACWR</w:t>
+        <w:t>Étape 3 : Détection du Découplage Externe/Interne &amp; Dérive Cardiaque</w:t>
       </w:r>
     </w:p>
     <w:p>
       <w:r>
-        <w:t>La quantification de la charge interne repose sur la méthode de Foster : Charge (u.a.) = Durée réelle (min) × RPE (1-10). Pour anticiper les risques de blessures sans sous-entraîner les sportifs, nous intégrons le ratio ACWR (Acute:Chronic Workload Ratio de Gabbett, 2016) :</w:t>
+        <w:t>Le marqueur le plus précoce du surentraînement n'est pas la blessure, mais le découplage physiologique entre la charge produite et l'effort ressenti :</w:t>
       </w:r>
     </w:p>
     <w:tbl>
@@ -320,7 +356,7 @@
                 <w:color w:val="1E3A8A"/>
                 <w:sz w:val="22"/>
               </w:rPr>
-              <w:t>📌 Paramétrage dans l'onglet '02_Calculs_Charges_ACWR'</w:t>
+              <w:t>📌 Le Syndrome de Découplage en Pratique</w:t>
               <w:br/>
             </w:r>
             <w:r>
@@ -329,23 +365,11 @@
                 <w:color w:val="334155"/>
                 <w:sz w:val="20"/>
               </w:rPr>
-              <w:t>1. Charge de séance en I5 : =G5*H5 (Durée × RPE).</w:t>
+              <w:t>1. Découplage RPE vs Distance : Observez les cas d'Ibrahima Koulibaly (ATH04) et Romain Claes (ATH11) en semaines 4 et 5. Leur distance parcourue et leur volume de sprint diminuent, alors que leur RPE atteint 9-10/10. Cela indique que l'organisme lutte pour produire un effort modéré.</w:t>
               <w:br/>
-              <w:t>2. Charge Aiguë (Acute Workload - 7 derniers jours) en J5 : Somme de la charge sur les 7 derniers jours pour l'athlète concerné.</w:t>
+              <w:t>2. Dérive de la Fréquence Cardiaque sous-maximale : Lors du test standardisé à 12 km/h, une élévation de la FC de +8 à +12 bpm à vitesse constante associée à une perte de détente au saut CMJ (&gt; -8%) signe une fatigue centrale et autonome sévère.</w:t>
               <w:br/>
-              <w:t>3. Charge Chronique (Chronic Workload - moyenne mobile 28 jours) en K5 : Moyenne des charges hebdomadaires sur 4 semaines.</w:t>
-              <w:br/>
-              <w:t>4. Ratio ACWR en L5 : =SI(K5&gt;0; J5/K5; 1.0)</w:t>
-              <w:br/>
-              <w:t>5. Définition des Zones de Risque :</w:t>
-              <w:br/>
-              <w:t xml:space="preserve">   - ACWR &lt; 0.8 : Zone de sous-charge (risque de désentraînement / vulnérabilité).</w:t>
-              <w:br/>
-              <w:t xml:space="preserve">   - 0.8 &lt;= ACWR &lt;= 1.3 : 'Sweet Spot' (zone optimale de progression et de protection).</w:t>
-              <w:br/>
-              <w:t xml:space="preserve">   - 1.3 &lt; ACWR &lt; 1.5 : Zone haute (surveillance accrue).</w:t>
-              <w:br/>
-              <w:t xml:space="preserve">   - ACWR &gt;= 1.5 : 'Danger Zone' (sur-charge aiguë critique, risque de blessure multiplié par 2 à 4).</w:t>
+              <w:t>3. Dette de sommeil et score Hooper : Tout score Hooper &gt;= 20 associé à moins de 6 heures de sommeil aggrave le risque de surmenage non fonctionnel.</w:t>
             </w:r>
           </w:p>
         </w:tc>
@@ -362,12 +386,12 @@
         <w:spacing w:before="280" w:after="120"/>
       </w:pPr>
       <w:r>
-        <w:t>Étape 3 : Traitement Longitudinal du Bien-Être &amp; Détection de Douleurs</w:t>
+        <w:t>Étape 4 : Modélisation Algorithmique du Score de Vulnérabilité</w:t>
       </w:r>
     </w:p>
     <w:p>
       <w:r>
-        <w:t>La feuille RAW_Bien-etre compile 504 enregistrements quotidiens. Vous devez créer une synthèse dynamique par joueur et par semaine. Le croisement des scores de fatigue (1-8), de courbatures musculaires (1-8) et des heures de sommeil permet d'anticiper les baisses de performance avant l'apparition d'une lésion clinique.</w:t>
+        <w:t>Dans la feuille '01_Modelisation_Algorithme', vous devez créer votre propre formule pondérée pour calculer un Score Composite de Vulnérabilité de 0 à 100 points :</w:t>
       </w:r>
     </w:p>
     <w:tbl>
@@ -409,7 +433,7 @@
                 <w:color w:val="1E3A8A"/>
                 <w:sz w:val="22"/>
               </w:rPr>
-              <w:t>📌 Alerte Rouge : Le Marqueur Douleur</w:t>
+              <w:t>📌 Exemple de Structure de Pondération de votre Score (/100)</w:t>
               <w:br/>
             </w:r>
             <w:r>
@@ -418,7 +442,15 @@
                 <w:color w:val="334155"/>
                 <w:sz w:val="20"/>
               </w:rPr>
-              <w:t>La colonne 'Douleur' (Oui/Non) est un commutateur binaire capital. Toute occurrence de 'Oui' associée à une note de courbatures &gt;= 6 doit automatiquement déclencher une alerte médicale dans votre tableau de bord, impliquant un retrait immédiat des exercices à haute intensité excentrique.</w:t>
+              <w:t>• Composante 1 : ACWR Distance &amp; Sprints (Pondération 35%) — Points attribués si ACWR &gt; 1.3 ou &gt; 1.5.</w:t>
+              <w:br/>
+              <w:t>• Composante 2 : Score de Récupération Hooper (Pondération 25%) — Points proportionnels à l'élévation du score (4 à 28).</w:t>
+              <w:br/>
+              <w:t>• Composante 3 : Découplage RPE / Production mécanique (Pondération 20%) — Points si RPE disproportionné.</w:t>
+              <w:br/>
+              <w:t>• Composante 4 : Perte Neuromusculaire CMJ (Pondération 20%) — Points si chute de performance au saut &gt; 5%.</w:t>
+              <w:br/>
+              <w:t>Classification : Vert (Score &lt; 45, Optimal) | Jaune (45-60, Vigilance) | Orange (60-75, Surmenage aigu FOR) | Rouge (&gt; 75, Surentraînement NFOR).</w:t>
             </w:r>
           </w:p>
         </w:tc>
@@ -435,93 +467,12 @@
         <w:spacing w:before="280" w:after="120"/>
       </w:pPr>
       <w:r>
-        <w:t>Étape 4 : Analyse Statistique Pré/Post des Tests Physiques</w:t>
+        <w:t>Étape 5 : Conception du Cockpit Staff &amp; Décisions Semaine 7</w:t>
       </w:r>
     </w:p>
     <w:p>
       <w:r>
-        <w:t>L'onglet '05_Tests_Physiques_PrePost' compare les bilans initiaux de la Semaine 1 aux bilans finaux de la Semaine 6. Pour chaque test, respectez rigoureusement la polarité du calcul :</w:t>
-      </w:r>
-    </w:p>
-    <w:tbl>
-      <w:tblPr>
-        <w:tblW w:type="auto" w:w="0"/>
-        <w:jc w:val="center"/>
-        <w:tblLayout w:type="fixed"/>
-        <w:tblLook w:firstColumn="1" w:firstRow="1" w:lastColumn="0" w:lastRow="0" w:noHBand="0" w:noVBand="1" w:val="04A0"/>
-      </w:tblPr>
-      <w:tblGrid>
-        <w:gridCol w:w="9360"/>
-      </w:tblGrid>
-      <w:tr>
-        <w:tc>
-          <w:tcPr>
-            <w:tcW w:type="dxa" w:w="9936"/>
-            <w:shd w:fill="EFF6FF"/>
-            <w:tcMar>
-              <w:top w:w="140" w:type="dxa"/>
-              <w:bottom w:w="140" w:type="dxa"/>
-              <w:left w:w="200" w:type="dxa"/>
-              <w:right w:w="200" w:type="dxa"/>
-            </w:tcMar>
-            <w:tcBorders>
-              <w:top w:val="none"/>
-              <w:left w:val="single" w:sz="36" w:space="0" w:color="1E3A8A"/>
-              <w:bottom w:val="none"/>
-              <w:right w:val="none"/>
-            </w:tcBorders>
-          </w:tcPr>
-          <w:p>
-            <w:pPr>
-              <w:spacing w:before="40" w:after="80"/>
-            </w:pPr>
-            <w:r>
-              <w:rPr>
-                <w:rFonts w:ascii="Calibri" w:hAnsi="Calibri"/>
-                <w:b/>
-                <w:color w:val="1E3A8A"/>
-                <w:sz w:val="22"/>
-              </w:rPr>
-              <w:t>📌 Formules des Deltas et Pourcentages de Progression</w:t>
-              <w:br/>
-            </w:r>
-            <w:r>
-              <w:rPr>
-                <w:rFonts w:ascii="Calibri" w:hAnsi="Calibri"/>
-                <w:color w:val="334155"/>
-                <w:sz w:val="20"/>
-              </w:rPr>
-              <w:t>• Sprint 10m (s) : Delta = Temps_S1 - Temps_S6 | Progression (%) = (Temps_S1 - Temps_S6) / Temps_S1 (Un delta positif est une amélioration).</w:t>
-              <w:br/>
-              <w:t>• Saut CMJ (cm) : Delta = CMJ_S6 - CMJ_S1 | Progression (%) = (CMJ_S6 - CMJ_S1) / CMJ_S1 (Un delta positif est une amélioration).</w:t>
-              <w:br/>
-              <w:t>• Test Yo-Yo IR1 (m) : Delta = Distance_S6 - Distance_S1 | Progression (%) = (Distance_S6 - Distance_S1) / Distance_S1.</w:t>
-              <w:br/>
-              <w:t>• Test Agilité 505 (s) : Delta = Temps_S1 - Temps_S6 | Progression (%) = (Temps_S1 - Temps_S6) / Temps_S1.</w:t>
-              <w:br/>
-              <w:t>• Ligne Totale : Utilisez la formule =MOYENNE() pour quantifier le bénéfice collectif moyen sur le groupe.</w:t>
-            </w:r>
-          </w:p>
-        </w:tc>
-      </w:tr>
-    </w:tbl>
-    <w:p>
-      <w:pPr>
-        <w:spacing w:before="80" w:after="120"/>
-      </w:pPr>
-    </w:p>
-    <w:p>
-      <w:pPr>
-        <w:pStyle w:val="Heading1"/>
-        <w:spacing w:before="280" w:after="120"/>
-      </w:pPr>
-      <w:r>
-        <w:t>Étape 5 : Conception du Tableau de Bord Exécutif Staff &amp; Décisions S7</w:t>
-      </w:r>
-    </w:p>
-    <w:p>
-      <w:r>
-        <w:t>L'onglet '00_Dashboard_Entraineur' est la vitrine de votre travail. Il doit pouvoir être lu et compris par le staff technique en moins de 60 secondes :</w:t>
+        <w:t>Dans la feuille '00_Cockpit_Anti_Surentrainement', créez une interface synthétique pour le staff :</w:t>
       </w:r>
     </w:p>
     <w:p>
@@ -529,7 +480,7 @@
         <w:pStyle w:val="ListBullet"/>
       </w:pPr>
       <w:r>
-        <w:t>• 5 Cartes KPI en haut d'écran (Effectif, Gains aérobie YoYo, Gains Vitesse 10m, Gains Détente CMJ, Alertes ACWR).</w:t>
+        <w:t>• Cartes KPI d'impact : Effectif disponible, Nombre de joueurs sous alerte rouge, Qualité moyenne du sommeil.</w:t>
       </w:r>
     </w:p>
     <w:p>
@@ -537,7 +488,7 @@
         <w:pStyle w:val="ListBullet"/>
       </w:pPr>
       <w:r>
-        <w:t>• Une Matrice des Alertes Décisionnelles avec code couleur (Rouge = Critique, Orange = Vigilance, Vert = Optimal).</w:t>
+        <w:t>• Matrice des cas critiques prioritaires (ex: Koulibaly, Claes, Dubois) avec actions médicales et physiques immédiates.</w:t>
       </w:r>
     </w:p>
     <w:p>
@@ -545,7 +496,7 @@
         <w:pStyle w:val="ListBullet"/>
       </w:pPr>
       <w:r>
-        <w:t>• 4 Préconisations Précises pour la Semaine 7 (Semaine précédant un match à fort enjeu) : volume, décharge ciblée, sommeil, protocole d'activation J-1.</w:t>
+        <w:t>• 4 Préconisations argumentées pour la Semaine 7 (tapering collectif, découplage des jeux réduits SSG, titularisations adaptées).</w:t>
       </w:r>
     </w:p>
     <w:p>
@@ -559,7 +510,7 @@
     </w:p>
     <w:p>
       <w:r>
-        <w:t>La consigne vous demande de concevoir ou prototyper un outil mobile simple. Dans l'onglet '06_Prototype_App_Mobile', détaillez l'architecture suivante :</w:t>
+        <w:t>Détaillez le fonctionnement d'une application smartphone connectée au tableur :</w:t>
       </w:r>
     </w:p>
     <w:p>
@@ -567,7 +518,7 @@
         <w:pStyle w:val="ListBullet"/>
       </w:pPr>
       <w:r>
-        <w:t>• Vue Athlète : Formulaire simplifié (RPE après entraînement en 2 clics, check-in matinal Hooper).</w:t>
+        <w:t>• Écran Athlète : Check-in matinal Hooper en 30 secondes + RPE post-séance en 2 clics.</w:t>
       </w:r>
     </w:p>
     <w:p>
@@ -575,7 +526,7 @@
         <w:pStyle w:val="ListBullet"/>
       </w:pPr>
       <w:r>
-        <w:t>• Vue Préparateur : Tableau des présences, voyants de risque ACWR, alertes en temps réel avant le début de séance.</w:t>
+        <w:t>• Écran Préparateur : Notification push automatique dès qu'un athlète dépasse le seuil critique avant l'entraînement.</w:t>
       </w:r>
     </w:p>
     <w:p>
@@ -583,73 +534,8 @@
         <w:pStyle w:val="ListBullet"/>
       </w:pPr>
       <w:r>
-        <w:t>• Connexion technique : Synchronisation directe avec le tableur (via Google Forms / AppSheet / Glide ou script API).</w:t>
+        <w:t>• Écran Entraîneur : Feu tricolore de disponibilité de l'effectif pour la mise en place tactique.</w:t>
       </w:r>
-    </w:p>
-    <w:tbl>
-      <w:tblPr>
-        <w:tblW w:type="auto" w:w="0"/>
-        <w:jc w:val="center"/>
-        <w:tblLayout w:type="fixed"/>
-        <w:tblLook w:firstColumn="1" w:firstRow="1" w:lastColumn="0" w:lastRow="0" w:noHBand="0" w:noVBand="1" w:val="04A0"/>
-      </w:tblPr>
-      <w:tblGrid>
-        <w:gridCol w:w="9360"/>
-      </w:tblGrid>
-      <w:tr>
-        <w:tc>
-          <w:tcPr>
-            <w:tcW w:type="dxa" w:w="9936"/>
-            <w:shd w:fill="EFF6FF"/>
-            <w:tcMar>
-              <w:top w:w="140" w:type="dxa"/>
-              <w:bottom w:w="140" w:type="dxa"/>
-              <w:left w:w="200" w:type="dxa"/>
-              <w:right w:w="200" w:type="dxa"/>
-            </w:tcMar>
-            <w:tcBorders>
-              <w:top w:val="none"/>
-              <w:left w:val="single" w:sz="36" w:space="0" w:color="1E3A8A"/>
-              <w:bottom w:val="none"/>
-              <w:right w:val="none"/>
-            </w:tcBorders>
-          </w:tcPr>
-          <w:p>
-            <w:pPr>
-              <w:spacing w:before="40" w:after="80"/>
-            </w:pPr>
-            <w:r>
-              <w:rPr>
-                <w:rFonts w:ascii="Calibri" w:hAnsi="Calibri"/>
-                <w:b/>
-                <w:color w:val="1E3A8A"/>
-                <w:sz w:val="22"/>
-              </w:rPr>
-              <w:t>📌 Critères d'Excellence pour la Note Maximale (30/30)</w:t>
-              <w:br/>
-            </w:r>
-            <w:r>
-              <w:rPr>
-                <w:rFonts w:ascii="Calibri" w:hAnsi="Calibri"/>
-                <w:color w:val="334155"/>
-                <w:sz w:val="20"/>
-              </w:rPr>
-              <w:t>✓ Rigueur mathématique absolue des formules sans rupture de référence.</w:t>
-              <w:br/>
-              <w:t>✓ Capacité à faire émerger des décisions concrètes d'entraînement plutôt que de simples graphiques décoratifs.</w:t>
-              <w:br/>
-              <w:t>✓ Prise en compte de la fatigue contextuelle (sommeil, postes de jeu, temps de jeu en match).</w:t>
-              <w:br/>
-              <w:t>✓ Clarté visuelle et ergonomie professionnelle du classeur Excel et du rapport écrit.</w:t>
-            </w:r>
-          </w:p>
-        </w:tc>
-      </w:tr>
-    </w:tbl>
-    <w:p>
-      <w:pPr>
-        <w:spacing w:before="80" w:after="120"/>
-      </w:pPr>
     </w:p>
     <w:sectPr>
       <w:pgSz w:w="12240" w:h="15840"/>

</xml_diff>